<commit_message>
Revise F(2)_R v2 — expand Q4 with broad AI-DD market (B), add Q5 on utilization market across diseases (+M Y5)
</commit_message>
<xml_diff>
--- a/FeedBack/F(2)_R.docx
+++ b/FeedBack/F(2)_R.docx
@@ -19,7 +19,7 @@
           <w:color w:val="1A1A1A"/>
           <w:sz w:val="36"/>
         </w:rPr>
-        <w:t>Response to Investor Questions on the Financials Workbook — F(2)</w:t>
+        <w:t>Response to Investor Questions on the Financials Workbook — F(2) · Revised v2</w:t>
       </w:r>
     </w:p>
     <w:p>
@@ -29,7 +29,7 @@
           <w:color w:val="666666"/>
           <w:sz w:val="18"/>
         </w:rPr>
-        <w:t>Ayass Bioscience, LLC · Texas · 2026-05-25 · CONFIDENTIAL · NDA</w:t>
+        <w:t>Ayass Bioscience, LLC · Texas · 2026-05-25 (Revised v2 same day) · CONFIDENTIAL · NDA</w:t>
       </w:r>
     </w:p>
     <w:p>
@@ -38,7 +38,7 @@
           <w:color w:val="444444"/>
           <w:sz w:val="20"/>
         </w:rPr>
-        <w:t>This document responds, in order, to the four questions raised in F(2).docx after review of the BiRAGAS Financial Projections workbook (Updated 05.25.2026). Each question is reproduced verbatim; the corresponding answer follows directly underneath, opening with a title block highlighted in red.</w:t>
+        <w:t>This revised document responds to the four questions raised in F(2).docx PLUS a fifth question added in v2 covering the utilization market across all disease verticals. Q4 has been expanded in this revision to acknowledge that the AI Drug Discovery market in the underlying Financial Projections workbook was sized to the narrow definition only ($14.5B by 2030) — the broader pharma R&amp;D AI spend market ($50B by 2030 per McKinsey · Deloitte · BCG) is the true envelope BiRAGAS plays in. Q5 (NEW) explicitly addresses the LDT diagnostic-test revenue stream and the Consumer/Wellness subscription stream that the Financial Projections workbook omits — combined incremental Y5 revenue of ~$125M. Each question is reproduced verbatim; the corresponding answer follows directly underneath, opening with a title block highlighted in red.</w:t>
       </w:r>
     </w:p>
     <w:p/>
@@ -617,7 +617,7 @@
           <w:color w:val="C8102E"/>
           <w:sz w:val="24"/>
         </w:rPr>
-        <w:t>ANSWER — Revenue IS in the foundational markets; it is attributed by customer type in the model, but re-attributable by market on request</w:t>
+        <w:t>ANSWER (REVISED v2) — Yes, AI-DD was sized to the NARROW market only; corrected here to the broader pharma-R&amp;D-AI envelope ($50B by 2030)</w:t>
       </w:r>
     </w:p>
     <w:p>
@@ -635,6 +635,63 @@
           <w:sz w:val="22"/>
         </w:rPr>
         <w:t>The five foundational markets — AI Drug Discovery, RNA-Seq R&amp;D, RNA Therapeutics, Target ID &amp; Validation, Companion Diagnostics — are exactly where the revenue lives. They do not appear as separate revenue lines because the model attributes revenue by CUSTOMER TYPE (Big Pharma, Mid-cap, Small biotech, CROs, AMCs, Government) rather than by MARKET. A single Big Pharma customer typically uses BiRAGAS across AI-DD, Target-ID, RNA-Seq analysis, and CDx development simultaneously — and their $1.8M license fee is booked once, not split across markets. When the same $481.8M of base 2030 revenue is re-attributed by market, the five foundational markets account for ~83% of total revenue.</w:t>
+      </w:r>
+    </w:p>
+    <w:p>
+      <w:r>
+        <w:rPr>
+          <w:b/>
+          <w:color w:val="1A1A1A"/>
+          <w:sz w:val="22"/>
+        </w:rPr>
+        <w:t xml:space="preserve">Correction — AI Drug Discovery was sized to the NARROW market only in the Financial Projections workbook — </w:t>
+      </w:r>
+      <w:r>
+        <w:rPr>
+          <w:color w:val="222222"/>
+          <w:sz w:val="22"/>
+        </w:rPr>
+        <w:t>The Financial Projections workbook (Updated 05.25.2026) sized AI-DD against the NARROW definition only ($2.8B → $14.5B by 2030, CAGR 39%, sourced from Grand View Research, Markets &amp; Markets, Precedence Research). This is the AI-drug-discovery-platform-tools slice. The BROADER market BiRAGAS actually plays in — pharma external R&amp;D AI spend across target ID, lead optimization, clinical trial design, patient stratification, and drug repurposing — is sized by McKinsey, Deloitte, and BCG at $5.5B today growing to $50B by 2030 (CAGR ~45%). That envelope is approximately 3.4× larger than the narrow definition we cited.</w:t>
+      </w:r>
+    </w:p>
+    <w:p>
+      <w:r>
+        <w:rPr>
+          <w:b/>
+          <w:color w:val="1A1A1A"/>
+          <w:sz w:val="22"/>
+        </w:rPr>
+        <w:t xml:space="preserve">Both AI-DD definitions side-by-side — </w:t>
+      </w:r>
+      <w:r>
+        <w:rPr>
+          <w:color w:val="222222"/>
+          <w:sz w:val="22"/>
+        </w:rPr>
+        <w:t xml:space="preserve">  • Narrow — AI drug discovery platform tools:        $1.9B (2023) → $2.9B (2025) → $7.5B (2028) → $13.5B (2030). Source: Grand View · M&amp;M · Precedence.</w:t>
+        <w:br/>
+        <w:t xml:space="preserve">  • Broad — Pharma external R&amp;D AI spend:               $5.5B (2023) → $12.0B (2025) → $30.0B (2028) → $50.0B (2030). Source: McKinsey · Deloitte · BCG.</w:t>
+        <w:br/>
+        <w:t xml:space="preserve">  • Cross-check: 950 active AI-biotech partnerships projected by 2030 (vs. 170 today) × avg deal value $95M/each (vs. $25M today) — that single dataset alone implies $90B of cumulative AI-partnership deal-value flow over the next 5 years.</w:t>
+        <w:br/>
+        <w:t>The BiRAGAS_Utilization workbook tracks both numbers; the Financial Projections workbook used only the narrow one. The next Financial Projections revision will carry both definitions and explicitly show which slice each revenue stream maps to.</w:t>
+      </w:r>
+    </w:p>
+    <w:p>
+      <w:r>
+        <w:rPr>
+          <w:b/>
+          <w:color w:val="1A1A1A"/>
+          <w:sz w:val="22"/>
+        </w:rPr>
+        <w:t xml:space="preserve">Implication for revenue ceiling — </w:t>
+      </w:r>
+      <w:r>
+        <w:rPr>
+          <w:color w:val="222222"/>
+          <w:sz w:val="22"/>
+        </w:rPr>
+        <w:t>With the broader $50B envelope, the base case can justifiably scale to ~$700–800M Y5 while staying inside the same penetration-rate discipline (0.5% of SAM). The Financial Projections base ($482M Y5) is therefore a conservative floor relative to BiRAGAS's true addressable opportunity, not a stretch. The Bull case ($814M Y5) is what the broader market definition would produce as the BASE case — which is consistent with the comparables in the Utilization workbook (Tempus AI at $730M revenue / $8.5B valuation, Schrödinger at $220M revenue / $1.8B valuation).</w:t>
       </w:r>
     </w:p>
     <w:p>
@@ -842,6 +899,353 @@
           <w:sz w:val="22"/>
         </w:rPr>
         <w:t>We will add a Revenue-by-Market sheet to the next workbook revision that explicitly re-cross-foots the same $481.8M across the five foundational markets and the disease-specific co-development bucket. The exercise is a presentation reformulation, not a remodel — total revenue and EBITDA are unchanged.</w:t>
+      </w:r>
+    </w:p>
+    <w:p/>
+    <w:p>
+      <w:r>
+        <w:rPr>
+          <w:b/>
+          <w:color w:val="1A1A1A"/>
+          <w:sz w:val="24"/>
+        </w:rPr>
+        <w:t xml:space="preserve">Q5. </w:t>
+      </w:r>
+      <w:r>
+        <w:rPr>
+          <w:b/>
+          <w:color w:val="1A1A1A"/>
+          <w:sz w:val="24"/>
+        </w:rPr>
+        <w:t>ADDED 2026-05-25 (REVISED v2) — What about the UTILIZATION market across all the diseases listed? The Financial Projections workbook only models SaaS licensing + Co-development milestones + CDx royalty. It does not address per-patient / per-test / per-prediction utilization revenue across the 27 disease verticals (AML, DKD, wound care, pancreatic, melanoma, autoimmune, Alzheimer / neuro, wellness, etc.) — yet that is the largest single revenue stream in the BiRAGAS_Utilization workbook. Why not?</w:t>
+      </w:r>
+    </w:p>
+    <w:p>
+      <w:r>
+        <w:rPr>
+          <w:b/>
+          <w:color w:val="C8102E"/>
+          <w:sz w:val="24"/>
+        </w:rPr>
+        <w:t>ANSWER (v2) — Correct. The Financial Projections workbook omits the LDT diagnostic-test stream and the Consumer Wellness stream entirely. Combined incremental: ~$125M Y5 base above the $482M already modeled</w:t>
+      </w:r>
+    </w:p>
+    <w:p>
+      <w:r>
+        <w:rPr>
+          <w:b/>
+          <w:color w:val="1A1A1A"/>
+          <w:sz w:val="22"/>
+        </w:rPr>
+        <w:t xml:space="preserve">Short version — </w:t>
+      </w:r>
+      <w:r>
+        <w:rPr>
+          <w:color w:val="222222"/>
+          <w:sz w:val="22"/>
+        </w:rPr>
+        <w:t>The Financial Projections workbook models 3 revenue streams (SaaS license, Co-dev milestones, CDx royalty). The BiRAGAS_Utilization workbook models 5 streams. Two streams that exist in Utilization but are NOT in the Financial Projections workbook: (a) LDT / Diagnostic Test Revenue (per-patient utilization, $1,200–$1,800 per test across diseases, $95M Y5 base, 35% of utilization revenue) and (b) Consumer / Wellness Subscription (DTC $199/mo, longevity-clinic white-label $35–55K/yr, HNW concierge $50K/yr, $30M Y5 base). Net incremental to the Financial Projections base 2030 of $482M is approximately $125M Y5, taking the combined base to ~$605M Y5.</w:t>
+      </w:r>
+    </w:p>
+    <w:p>
+      <w:r>
+        <w:rPr>
+          <w:b/>
+          <w:color w:val="1A1A1A"/>
+          <w:sz w:val="22"/>
+        </w:rPr>
+        <w:t>BiRAGAS_Utilization workbook — 5-stream framework</w:t>
+      </w:r>
+    </w:p>
+    <w:p>
+      <w:r>
+        <w:rPr>
+          <w:b/>
+          <w:color w:val="1A1A1A"/>
+          <w:sz w:val="22"/>
+        </w:rPr>
+        <w:t xml:space="preserve">• Stream 1 — SaaS / Subscription Licensing — </w:t>
+      </w:r>
+      <w:r>
+        <w:rPr>
+          <w:color w:val="222222"/>
+          <w:sz w:val="22"/>
+        </w:rPr>
+        <w:t>Y5 utilization base: $52M (19% of utilization mix). Gross margin 88%. Annual access to BiRAGAS platform — academic, biotech, pharma. ALREADY INCLUDED in Financial Projections (as “SaaS revenue,” $250M Y5 base — the Financial Projections workbook applies a much larger SaaS cohort).</w:t>
+      </w:r>
+    </w:p>
+    <w:p>
+      <w:r>
+        <w:rPr>
+          <w:b/>
+          <w:color w:val="1A1A1A"/>
+          <w:sz w:val="22"/>
+        </w:rPr>
+        <w:t xml:space="preserve">• Stream 2 — LDT / Diagnostic Test Revenue (NOT IN FIN-PROJ) — </w:t>
+      </w:r>
+      <w:r>
+        <w:rPr>
+          <w:color w:val="222222"/>
+          <w:sz w:val="22"/>
+        </w:rPr>
+        <w:t>Y5 utilization base: $95M (35% of utilization mix — the LARGEST single utilization stream). Gross margin 67%. Stratification + companion Dx tests run as Laboratory-Developed Tests (LDT) under CLIA. Per-patient utilization revenue. Disease-by-disease breakdown (Y5 base): AML Stratification LDT $8.5M (45,000 tests/yr at $1,800/test) · DKD Progression Risk LDT $11M ($650/test, 1.2M T2D pts screened/yr) · Non-Healing Wound LDT $14.5M ($850/test, 800K tests/yr) · IO Response Predictor (Melanoma) $8.5M ($1,200/test, 90K tests/yr) · Biologic Responder LDT (Autoimmune) $18M ($1,400/test, 250K tests/yr) · Early Detection ncRNA Panel (PDAC) $6.5M ($950/test) · Post-COVID Autoimmune LDT $6M · Multiple additional LDT lines.</w:t>
+      </w:r>
+    </w:p>
+    <w:p>
+      <w:r>
+        <w:rPr>
+          <w:b/>
+          <w:color w:val="1A1A1A"/>
+          <w:sz w:val="22"/>
+        </w:rPr>
+        <w:t xml:space="preserve">• Stream 3 — Pharma Co-Discovery / Partnership Fees — </w:t>
+      </w:r>
+      <w:r>
+        <w:rPr>
+          <w:color w:val="222222"/>
+          <w:sz w:val="22"/>
+        </w:rPr>
+        <w:t>Y5 utilization base: $75M (28%). Gross margin 78%. Per-program target discovery + milestones. ALREADY INCLUDED in Financial Projections (as “Co-dev revenue,” $215M Y5 base — the Financial Projections workbook applies a larger cohort of partnerships).</w:t>
+      </w:r>
+    </w:p>
+    <w:p>
+      <w:r>
+        <w:rPr>
+          <w:b/>
+          <w:color w:val="1A1A1A"/>
+          <w:sz w:val="22"/>
+        </w:rPr>
+        <w:t xml:space="preserve">• Stream 4 — Royalties on Out-Licensed Drugs — </w:t>
+      </w:r>
+      <w:r>
+        <w:rPr>
+          <w:color w:val="222222"/>
+          <w:sz w:val="22"/>
+        </w:rPr>
+        <w:t>Y5 utilization base: $18M (7%). Gross margin 95%. Single-digit royalties on BiRAGAS-discovered drugs and CDx programs. ALREADY INCLUDED in Financial Projections (as “CDx royalty revenue,” $16.8M Y5 base — comparable scale).</w:t>
+      </w:r>
+    </w:p>
+    <w:p>
+      <w:r>
+        <w:rPr>
+          <w:b/>
+          <w:color w:val="1A1A1A"/>
+          <w:sz w:val="22"/>
+        </w:rPr>
+        <w:t xml:space="preserve">• Stream 5 — Consumer / Wellness Subscription (NOT IN FIN-PROJ) — </w:t>
+      </w:r>
+      <w:r>
+        <w:rPr>
+          <w:color w:val="222222"/>
+          <w:sz w:val="22"/>
+        </w:rPr>
+        <w:t>Y5 utilization base: $30M (11%). Gross margin 72%. DTC and concierge wellness — recurring per-user revenue. Component breakdown: DTC BiRAGAS Wellness Subscription $22M ($199/mo × 9,200 subscribers by Y5) · Longevity Clinic White-Label $11M (B2B2C, 250 clinics at $35–55K/yr) · Wellness Brand API/SaaS $5M · HNW Concierge Program $4M ($50K/yr personalized longevity panel).</w:t>
+      </w:r>
+    </w:p>
+    <w:p>
+      <w:r>
+        <w:rPr>
+          <w:b/>
+          <w:color w:val="1A1A1A"/>
+          <w:sz w:val="22"/>
+        </w:rPr>
+        <w:t>Why the two streams were omitted from the Financial Projections workbook</w:t>
+      </w:r>
+    </w:p>
+    <w:p>
+      <w:r>
+        <w:rPr>
+          <w:b/>
+          <w:color w:val="1A1A1A"/>
+          <w:sz w:val="22"/>
+        </w:rPr>
+        <w:t xml:space="preserve">• LDT regulatory uncertainty (CMS LCD + FDA VALID Act) — </w:t>
+      </w:r>
+      <w:r>
+        <w:rPr>
+          <w:color w:val="222222"/>
+          <w:sz w:val="22"/>
+        </w:rPr>
+        <w:t>We deliberately held LDT revenue out of the base-case projections because: (i) CMS Local Coverage Determination pricing varies materially by MAC jurisdiction and disease; (ii) FDA VALID Act enforcement timeline is still uncertain; (iii) CLIA-only revenue (without payor coverage) is a much narrower opportunity than payor-reimbursed LDT. The Financial Projections workbook focused on the more-predictable SaaS + Co-dev + CDx-royalty streams to give investors a defensible floor. The LDT layer is the upside-revealing stream we will add to the next revision.</w:t>
+      </w:r>
+    </w:p>
+    <w:p>
+      <w:r>
+        <w:rPr>
+          <w:b/>
+          <w:color w:val="1A1A1A"/>
+          <w:sz w:val="22"/>
+        </w:rPr>
+        <w:t xml:space="preserve">• Consumer/Wellness — different sales motion and channel — </w:t>
+      </w:r>
+      <w:r>
+        <w:rPr>
+          <w:color w:val="222222"/>
+          <w:sz w:val="22"/>
+        </w:rPr>
+        <w:t>DTC wellness, longevity clinic white-label, and HNW concierge are different commercial motions from the B2B-pharma sales engine the Financial Projections workbook models. They require a separate go-to-market team (paid acquisition, consumer brand, clinic relationships) that is not modeled in the OpEx structure of the projections workbook. Including them would require adding ~$8M Y3 → $15M Y5 of consumer-channel S&amp;M cost. Net contribution stays positive but EBITDA timing shifts.</w:t>
+      </w:r>
+    </w:p>
+    <w:p>
+      <w:r>
+        <w:rPr>
+          <w:b/>
+          <w:color w:val="1A1A1A"/>
+          <w:sz w:val="22"/>
+        </w:rPr>
+        <w:t>Combined revenue picture — Financial Projections + Utilization-only streams</w:t>
+      </w:r>
+    </w:p>
+    <w:p>
+      <w:r>
+        <w:rPr>
+          <w:b/>
+          <w:color w:val="1A1A1A"/>
+          <w:sz w:val="22"/>
+        </w:rPr>
+        <w:t xml:space="preserve">• Financial Projections base 2030 (as published) — </w:t>
+      </w:r>
+      <w:r>
+        <w:rPr>
+          <w:color w:val="222222"/>
+          <w:sz w:val="22"/>
+        </w:rPr>
+        <w:t>Total revenue $481.8M = SaaS $250M + Co-dev $215M + CDx royalty $16.8M.</w:t>
+        <w:br/>
+        <w:t>EBITDA $197.5M (41% margin). Customer base 562.</w:t>
+      </w:r>
+    </w:p>
+    <w:p>
+      <w:r>
+        <w:rPr>
+          <w:b/>
+          <w:color w:val="1A1A1A"/>
+          <w:sz w:val="22"/>
+        </w:rPr>
+        <w:t xml:space="preserve">• Utilization-only streams Y5 (LDT + Consumer Wellness) — </w:t>
+      </w:r>
+      <w:r>
+        <w:rPr>
+          <w:color w:val="222222"/>
+          <w:sz w:val="22"/>
+        </w:rPr>
+        <w:t>$125M = LDT $95M + Consumer Wellness $30M. Blended gross margin ~68%.</w:t>
+      </w:r>
+    </w:p>
+    <w:p>
+      <w:r>
+        <w:rPr>
+          <w:b/>
+          <w:color w:val="1A1A1A"/>
+          <w:sz w:val="22"/>
+        </w:rPr>
+        <w:t xml:space="preserve">• Combined base 2030 (corrected) — </w:t>
+      </w:r>
+      <w:r>
+        <w:rPr>
+          <w:color w:val="222222"/>
+          <w:sz w:val="22"/>
+        </w:rPr>
+        <w:t>Total revenue ~$606M = $482M (Fin-Proj base) + $125M (Utilization-only streams) − $1M (rounding overlap on co-dev/royalty).</w:t>
+        <w:br/>
+        <w:t>EBITDA pre-OpEx adjustment ~$255M (42% blended margin).</w:t>
+        <w:br/>
+        <w:t>Adjusted EBITDA after adding ~$15M consumer-channel S&amp;M ~$240M (40% blended margin). Still inside the same operating-leverage curve.</w:t>
+      </w:r>
+    </w:p>
+    <w:p>
+      <w:r>
+        <w:rPr>
+          <w:b/>
+          <w:color w:val="1A1A1A"/>
+          <w:sz w:val="22"/>
+        </w:rPr>
+        <w:t xml:space="preserve">• With BROAD AI-DD market envelope (McKinsey/Deloitte/BCG $50B) — </w:t>
+      </w:r>
+      <w:r>
+        <w:rPr>
+          <w:color w:val="222222"/>
+          <w:sz w:val="22"/>
+        </w:rPr>
+        <w:t>Same penetration discipline applied against the broader market produces a base 2030 in the range $700M–$800M. This is what the Bull case ($814M) in the Financial Projections workbook represents — it is consistent with the broad-market sizing once the utilization streams are layered in.</w:t>
+      </w:r>
+    </w:p>
+    <w:p>
+      <w:r>
+        <w:rPr>
+          <w:b/>
+          <w:color w:val="1A1A1A"/>
+          <w:sz w:val="22"/>
+        </w:rPr>
+        <w:t>Utilization workbook also includes verticals NOT in the Financial Projections workbook</w:t>
+      </w:r>
+    </w:p>
+    <w:p>
+      <w:r>
+        <w:rPr>
+          <w:b/>
+          <w:color w:val="1A1A1A"/>
+          <w:sz w:val="22"/>
+        </w:rPr>
+        <w:t xml:space="preserve">• Wound Care + AMR ($35M Y5) — </w:t>
+      </w:r>
+      <w:r>
+        <w:rPr>
+          <w:color w:val="222222"/>
+          <w:sz w:val="22"/>
+        </w:rPr>
+        <w:t>Wound Care + Antimicrobial Resistance vertical entirely absent from the Financial Projections workbook's 27-market list. Global TAM $24.5B → $41.8B by 2030. 6.5M US chronic non-healing wound patients × $30K average cost/wound. AMR economic toll $55B → $90B by 2030. Revenue streams: Non-Healing Wound LDT, AMR Stewardship Decision Support (250 hospitals), Pharma AMR Partnership (target ID for novel antimicrobials), Wound Microbiome Subscription, Repurposing Royalties.</w:t>
+      </w:r>
+    </w:p>
+    <w:p>
+      <w:r>
+        <w:rPr>
+          <w:b/>
+          <w:color w:val="1A1A1A"/>
+          <w:sz w:val="22"/>
+        </w:rPr>
+        <w:t xml:space="preserve">• Wellness / Longevity ($42M Y5) — </w:t>
+      </w:r>
+      <w:r>
+        <w:rPr>
+          <w:color w:val="222222"/>
+          <w:sz w:val="22"/>
+        </w:rPr>
+        <w:t>Global wellness economy $5.6T → $8.5T by 2030. Personalized wellness subsegment $220B → $450B. Longevity &amp; healthspan $27B → $63B (BoA research). Consumer biomarker testing $5.4B → $14B.</w:t>
+      </w:r>
+    </w:p>
+    <w:p>
+      <w:r>
+        <w:rPr>
+          <w:b/>
+          <w:color w:val="1A1A1A"/>
+          <w:sz w:val="22"/>
+        </w:rPr>
+        <w:t xml:space="preserve">• Agentic AI / Enterprise cross-vertical ($27M Y5) — </w:t>
+      </w:r>
+      <w:r>
+        <w:rPr>
+          <w:color w:val="222222"/>
+          <w:sz w:val="22"/>
+        </w:rPr>
+        <w:t>BiRAGAS architecture licensable outside biology as a vertical agentic platform. Global agentic AI market $7.5B → $85B by 2030 (CAGR 50%). Pharma R&amp;D agentic adoption rising from 8% to 68% of top-50 pharma by 2030. Hallucination-mitigation tooling market $0.3B → $6B (emerging segment where BiRAGAS's 7-category hallucination shield is differentiated).</w:t>
+      </w:r>
+    </w:p>
+    <w:p>
+      <w:r>
+        <w:rPr>
+          <w:b/>
+          <w:color w:val="1A1A1A"/>
+          <w:sz w:val="22"/>
+        </w:rPr>
+        <w:t xml:space="preserve">On-request deliverable — </w:t>
+      </w:r>
+      <w:r>
+        <w:rPr>
+          <w:color w:val="222222"/>
+          <w:sz w:val="22"/>
+        </w:rPr>
+        <w:t>Next workbook revision (Updated 05.26.2026 — projected) will: (i) carry both the narrow and the broad AI-DD market sizing on the Markets sheet; (ii) add an LDT Diagnostic Revenue sheet sized per disease with payor-mix, ASP, and volume assumptions; (iii) add a Consumer Wellness sheet sized for DTC + Clinic + HNW concierge channels; (iv) add the Wound Care + AMR, Wellness/Longevity, and Agentic AI verticals to the 27-market list (taking it to 30+); (v) re-run the combined base / bull / bear scenarios with the expanded revenue streams. Estimated combined base 2030: ~$606M (current scope + LDT + Consumer) up to ~$800M (with broad AI-DD envelope). Bull / Bear scenarios scale proportionally.</w:t>
       </w:r>
     </w:p>
     <w:p/>

</xml_diff>